<commit_message>
corrigindo após buildar frontEnd
</commit_message>
<xml_diff>
--- a/doc/react.docx
+++ b/doc/react.docx
@@ -18686,6 +18686,7 @@
       </w:pPr>
       <w:r>
         <w:rPr>
+          <w:noProof/>
           <w:u w:val="single"/>
         </w:rPr>
         <w:lastRenderedPageBreak/>
@@ -18733,6 +18734,7 @@
       </w:r>
       <w:r>
         <w:rPr>
+          <w:noProof/>
           <w:u w:val="single"/>
         </w:rPr>
         <w:drawing>
@@ -18872,6 +18874,7 @@
       </w:pPr>
       <w:r>
         <w:rPr>
+          <w:noProof/>
           <w:u w:val="single"/>
         </w:rPr>
         <w:lastRenderedPageBreak/>
@@ -18998,6 +19001,7 @@
       </w:pPr>
       <w:r>
         <w:rPr>
+          <w:noProof/>
           <w:u w:val="single"/>
         </w:rPr>
         <w:drawing>
@@ -19059,6 +19063,7 @@
       </w:pPr>
       <w:r>
         <w:rPr>
+          <w:noProof/>
           <w:u w:val="single"/>
         </w:rPr>
         <w:drawing>
@@ -19257,6 +19262,7 @@
       </w:pPr>
       <w:r>
         <w:rPr>
+          <w:noProof/>
           <w:u w:val="single"/>
         </w:rPr>
         <w:drawing>
@@ -19901,6 +19907,7 @@
       </w:pPr>
       <w:r>
         <w:rPr>
+          <w:noProof/>
           <w:u w:val="single"/>
         </w:rPr>
         <w:drawing>
@@ -19948,6 +19955,7 @@
       </w:pPr>
       <w:r>
         <w:rPr>
+          <w:noProof/>
           <w:u w:val="single"/>
         </w:rPr>
         <w:drawing>
@@ -19995,6 +20003,7 @@
       </w:pPr>
       <w:r>
         <w:rPr>
+          <w:noProof/>
           <w:u w:val="single"/>
         </w:rPr>
         <w:lastRenderedPageBreak/>
@@ -20043,6 +20052,7 @@
       </w:pPr>
       <w:r>
         <w:rPr>
+          <w:noProof/>
           <w:u w:val="single"/>
         </w:rPr>
         <w:lastRenderedPageBreak/>
@@ -20090,6 +20100,7 @@
       </w:r>
       <w:r>
         <w:rPr>
+          <w:noProof/>
           <w:u w:val="single"/>
         </w:rPr>
         <w:drawing>
@@ -25975,6 +25986,7 @@
   <w:style w:type="character" w:default="1" w:styleId="Fontepargpadro">
     <w:name w:val="Default Paragraph Font"/>
     <w:uiPriority w:val="1"/>
+    <w:semiHidden/>
     <w:unhideWhenUsed/>
   </w:style>
   <w:style w:type="table" w:default="1" w:styleId="Tabelanormal">

</xml_diff>